<commit_message>
Rebuild the manuscript derivatives and the release for the one-question paper
Three DOCX derivatives from the recorded commands, three PDFs converted with
Word and pinned by extracted text and page count, provenance recorded after
the release copied them into the DSH bundle, and the release rebuilt once
more with the reused timestamp to show it converges. The figure lineage is
refreshed to the final probe artifact. The validator parses 92 JSON and 76
CSV files, every one of 400 in-repository checksum claims verifies, and the
derivative check reports the ten derivatives current with both sources.

Co-Authored-By: Claude Fable 5.1 <noreply@anthropic.com>
</commit_message>
<xml_diff>
--- a/paper/Chinese_Rap_Evidence_Grounded_Supplement.docx
+++ b/paper/Chinese_Rap_Evidence_Grounded_Supplement.docx
@@ -36,7 +36,71 @@
           <w:color w:val="000000"/>
           <w:sz w:val="24"/>
         </w:rPr>
-        <w:t>Table S1 records the executable environment used or recovered for the frozen analyses. The vector and result artifacts are hash-addressed. The historical device and realized mixed-precision setting used for the original BGE-M3 encoding were not captured; current hardware is not treated as evidence of that earlier run.</w:t>
+        <w:t xml:space="preserve">Table S1 records the executable environment used or recovered for the analyses. The vector and result artifacts are hash-addressed. The BGE-M3 vectors used in the article come from a single recorded run over corpus v2 (contract </w:t>
+      </w:r>
+      <w:r>
+        <w:rPr>
+          <w:rFonts w:ascii="Courier New" w:hAnsi="Courier New" w:eastAsia="Courier New" w:cs="Courier New"/>
+          <w:color w:val="000000"/>
+          <w:sz w:val="23"/>
+        </w:rPr>
+        <w:t>chinese-rap-repaired-corpus-embeddings-v2/1.0.0</w:t>
+      </w:r>
+      <w:r>
+        <w:rPr>
+          <w:rFonts w:ascii="Times New Roman" w:hAnsi="Times New Roman" w:eastAsia="Times New Roman" w:cs="Times New Roman"/>
+          <w:color w:val="000000"/>
+          <w:sz w:val="24"/>
+        </w:rPr>
+        <w:t xml:space="preserve">): Tesla T4, half precision, batch size 8, maximum length 2,048, corpus source order, checkpoint weights SHA-256 </w:t>
+      </w:r>
+      <w:r>
+        <w:rPr>
+          <w:rFonts w:ascii="Courier New" w:hAnsi="Courier New" w:eastAsia="Courier New" w:cs="Courier New"/>
+          <w:color w:val="000000"/>
+          <w:sz w:val="23"/>
+        </w:rPr>
+        <w:t>b5e0ce34…6aad38</w:t>
+      </w:r>
+      <w:r>
+        <w:rPr>
+          <w:rFonts w:ascii="Times New Roman" w:hAnsi="Times New Roman" w:eastAsia="Times New Roman" w:cs="Times New Roman"/>
+          <w:color w:val="000000"/>
+          <w:sz w:val="24"/>
+        </w:rPr>
+        <w:t xml:space="preserve">, corpus content SHA-256 </w:t>
+      </w:r>
+      <w:r>
+        <w:rPr>
+          <w:rFonts w:ascii="Courier New" w:hAnsi="Courier New" w:eastAsia="Courier New" w:cs="Courier New"/>
+          <w:color w:val="000000"/>
+          <w:sz w:val="23"/>
+        </w:rPr>
+        <w:t>8102da32…4b313b</w:t>
+      </w:r>
+      <w:r>
+        <w:rPr>
+          <w:rFonts w:ascii="Times New Roman" w:hAnsi="Times New Roman" w:eastAsia="Times New Roman" w:cs="Times New Roman"/>
+          <w:color w:val="000000"/>
+          <w:sz w:val="24"/>
+        </w:rPr>
+        <w:t>; a resume under any other device, precision, weights, or corpus is refused. The earlier corpus's vectors had been produced under an unrecorded device and precision; the configuration probe (</w:t>
+      </w:r>
+      <w:r>
+        <w:rPr>
+          <w:rFonts w:ascii="Courier New" w:hAnsi="Courier New" w:eastAsia="Courier New" w:cs="Courier New"/>
+          <w:color w:val="000000"/>
+          <w:sz w:val="23"/>
+        </w:rPr>
+        <w:t>results/embedding-configuration-probe-v1</w:t>
+      </w:r>
+      <w:r>
+        <w:rPr>
+          <w:rFonts w:ascii="Times New Roman" w:hAnsi="Times New Roman" w:eastAsia="Times New Roman" w:cs="Times New Roman"/>
+          <w:color w:val="000000"/>
+          <w:sz w:val="24"/>
+        </w:rPr>
+        <w:t>) found that three candidate configurations all reproduce them within a cosine tolerance of 2.2 × 10⁻⁵, which bounds the concern without identifying the configuration, and the single recorded run replaces them.</w:t>
       </w:r>
     </w:p>
     <w:tbl>
@@ -388,7 +452,7 @@
                 <w:color w:val="000000"/>
                 <w:sz w:val="18"/>
               </w:rPr>
-              <w:t>; FlagEmbedding 1.4.0; PyTorch 2.11.0+cu128</w:t>
+              <w:t>; FlagEmbedding 1.4.0; PyTorch 2.11.0+cu128; Tesla T4</w:t>
             </w:r>
           </w:p>
         </w:tc>
@@ -430,7 +494,23 @@
                 <w:color w:val="000000"/>
                 <w:sz w:val="18"/>
               </w:rPr>
-              <w:t>; batch 2; L2 normalization</w:t>
+              <w:t xml:space="preserve">; batch 8; </w:t>
+            </w:r>
+            <w:r>
+              <w:rPr>
+                <w:rFonts w:ascii="Courier New" w:hAnsi="Courier New" w:eastAsia="Courier New" w:cs="Courier New"/>
+                <w:color w:val="000000"/>
+                <w:sz w:val="17"/>
+              </w:rPr>
+              <w:t>use_fp16=True</w:t>
+            </w:r>
+            <w:r>
+              <w:rPr>
+                <w:rFonts w:ascii="Times New Roman" w:hAnsi="Times New Roman" w:eastAsia="Times New Roman" w:cs="Times New Roman"/>
+                <w:color w:val="000000"/>
+                <w:sz w:val="18"/>
+              </w:rPr>
+              <w:t>; L2 normalization</w:t>
             </w:r>
           </w:p>
         </w:tc>
@@ -456,7 +536,7 @@
                 <w:color w:val="000000"/>
                 <w:sz w:val="18"/>
               </w:rPr>
-              <w:t xml:space="preserve">Checkpoint/files and frozen vector hash verified; historical device and realized </w:t>
+              <w:t xml:space="preserve">Single recorded run over corpus v2; checkpoint weights, corpus digest, device, and precision pinned in the run contract; vector file SHA-256 </w:t>
             </w:r>
             <w:r>
               <w:rPr>
@@ -464,15 +544,7 @@
                 <w:color w:val="000000"/>
                 <w:sz w:val="17"/>
               </w:rPr>
-              <w:t>use_fp16</w:t>
-            </w:r>
-            <w:r>
-              <w:rPr>
-                <w:rFonts w:ascii="Times New Roman" w:hAnsi="Times New Roman" w:eastAsia="Times New Roman" w:cs="Times New Roman"/>
-                <w:color w:val="000000"/>
-                <w:sz w:val="18"/>
-              </w:rPr>
-              <w:t xml:space="preserve"> unavailable</w:t>
+              <w:t>247e9619…51da1</w:t>
             </w:r>
           </w:p>
         </w:tc>
@@ -1233,7 +1305,7 @@
         <w:pStyle w:val="Heading1"/>
       </w:pPr>
       <w:r>
-        <w:t>S4. Repertoire-Graph Null and Projection Diagnostics</w:t>
+        <w:t>S4. Repertoire-Graph Null and Projection Diagnostics (companion interface only)</w:t>
       </w:r>
     </w:p>
     <w:p>
@@ -1247,7 +1319,7 @@
           <w:color w:val="000000"/>
           <w:sz w:val="24"/>
         </w:rPr>
-        <w:t xml:space="preserve">The published graph is the intersection of a 140-edge reciprocal-top-five network under primary duplicate control and a 145-edge network after cross-label shared-text exclusion. The observed intersection contains 86 edges. The primary null holds the first network fixed and applies 1,450 successful undirected double-edge swaps to the second network per replicate, preserving its complete node-degree sequence while randomizing endpoints. Across 10,000 fixed-seed replicates, the null intersection has mean 4.524, median 4, 95% range 1–9, and maximum 13; no replicate reaches 86, giving an add-one Monte Carlo </w:t>
+        <w:t xml:space="preserve">The interactive companion's repertoire graph is not used as evidence in the article; this section is retained so that the interface's own diagnostics remain documented. The published graph is the intersection of a 140-edge reciprocal-top-five network under primary duplicate control and a 145-edge network after cross-label shared-text exclusion. The observed intersection contains 86 edges. The primary null holds the first network fixed and applies 1,450 successful undirected double-edge swaps to the second network per replicate, preserving its complete node-degree sequence while randomizing endpoints. Across 10,000 fixed-seed replicates, the null intersection has mean 4.524, median 4, 95% range 1–9, and maximum 13; no replicate reaches 86, giving an add-one Monte Carlo </w:t>
       </w:r>
       <w:r>
         <w:rPr>
@@ -1521,6 +1593,543 @@
           <w:sz w:val="24"/>
         </w:rPr>
         <w:t xml:space="preserve"> separates verified local facts from the owner-supplied information required before journal submission.</w:t>
+      </w:r>
+    </w:p>
+    <w:p>
+      <w:pPr>
+        <w:pStyle w:val="Heading1"/>
+      </w:pPr>
+      <w:r>
+        <w:t>S8. Leakage Groups, Label Identity Audit, and the Rhyme-Form Space</w:t>
+      </w:r>
+    </w:p>
+    <w:p>
+      <w:pPr>
+        <w:widowControl/>
+        <w:spacing w:line="480" w:lineRule="auto" w:after="0"/>
+      </w:pPr>
+      <w:r>
+        <w:rPr>
+          <w:rFonts w:ascii="Times New Roman" w:hAnsi="Times New Roman" w:eastAsia="Times New Roman" w:cs="Times New Roman"/>
+          <w:b/>
+          <w:color w:val="000000"/>
+          <w:sz w:val="24"/>
+        </w:rPr>
+        <w:t>Leakage groups.</w:t>
+      </w:r>
+      <w:r>
+        <w:rPr>
+          <w:rFonts w:ascii="Times New Roman" w:hAnsi="Times New Roman" w:eastAsia="Times New Roman" w:cs="Times New Roman"/>
+          <w:color w:val="000000"/>
+          <w:sz w:val="24"/>
+        </w:rPr>
+        <w:t xml:space="preserve"> Over the 7,236 query songs, two songs share a leakage group when they share a corpus v2 exact-text component or when their whole-song character-trigram sets have Jaccard similarity of at least 0.80 after NFKC normalisation, case folding, and removal of punctuation and spaces; groups are connected components of the union. Neither rule contains the other: 404 of 799 multi-song text components would be split by the near-duplicate rule alone, and 44 near-duplicate pairs share no text component. The union yields 5,888 groups, 798 with more than one song, the largest with 27; every label retains at least five groups (median 33). Each half of the union is scored alone as an ablation in </w:t>
+      </w:r>
+      <w:r>
+        <w:rPr>
+          <w:rFonts w:ascii="Courier New" w:hAnsi="Courier New" w:eastAsia="Courier New" w:cs="Courier New"/>
+          <w:color w:val="000000"/>
+          <w:sz w:val="23"/>
+        </w:rPr>
+        <w:t>results/retrieval-v2/analysis_summary.json</w:t>
+      </w:r>
+      <w:r>
+        <w:rPr>
+          <w:rFonts w:ascii="Times New Roman" w:hAnsi="Times New Roman" w:eastAsia="Times New Roman" w:cs="Times New Roman"/>
+          <w:color w:val="000000"/>
+          <w:sz w:val="24"/>
+        </w:rPr>
+        <w:t xml:space="preserve">. The module </w:t>
+      </w:r>
+      <w:r>
+        <w:rPr>
+          <w:rFonts w:ascii="Courier New" w:hAnsi="Courier New" w:eastAsia="Courier New" w:cs="Courier New"/>
+          <w:color w:val="000000"/>
+          <w:sz w:val="23"/>
+        </w:rPr>
+        <w:t>src/leakage_groups_v2.py</w:t>
+      </w:r>
+      <w:r>
+        <w:rPr>
+          <w:rFonts w:ascii="Times New Roman" w:hAnsi="Times New Roman" w:eastAsia="Times New Roman" w:cs="Times New Roman"/>
+          <w:color w:val="000000"/>
+          <w:sz w:val="24"/>
+        </w:rPr>
+        <w:t xml:space="preserve"> carries fifteen tests, each rule tested alone before the union and the invariant shown to be falsifiable. The written-rhyme partitions use the same unit: assigning songs individually, as the earlier build did, would have placed 433 of 799 multi-song components across a partition boundary, touching 1,330 song records.</w:t>
+      </w:r>
+    </w:p>
+    <w:p>
+      <w:pPr>
+        <w:widowControl/>
+        <w:spacing w:line="480" w:lineRule="auto" w:after="0"/>
+        <w:ind w:firstLine="360"/>
+      </w:pPr>
+      <w:r>
+        <w:rPr>
+          <w:rFonts w:ascii="Times New Roman" w:hAnsi="Times New Roman" w:eastAsia="Times New Roman" w:cs="Times New Roman"/>
+          <w:b/>
+          <w:color w:val="000000"/>
+          <w:sz w:val="24"/>
+        </w:rPr>
+        <w:t>Label identity.</w:t>
+      </w:r>
+      <w:r>
+        <w:rPr>
+          <w:rFonts w:ascii="Times New Roman" w:hAnsi="Times New Roman" w:eastAsia="Times New Roman" w:cs="Times New Roman"/>
+          <w:color w:val="000000"/>
+          <w:sz w:val="24"/>
+        </w:rPr>
+        <w:t xml:space="preserve"> Among 241 labels, no pair is identical after NFKC normalisation, case folding, and removal of spaces and punctuation, and all twelve substring candidates are stage-name particles (</w:t>
+      </w:r>
+      <w:r>
+        <w:rPr>
+          <w:rFonts w:ascii="Courier New" w:hAnsi="Courier New" w:eastAsia="Courier New" w:cs="Courier New"/>
+          <w:color w:val="000000"/>
+          <w:sz w:val="23"/>
+        </w:rPr>
+        <w:t>ICE</w:t>
+      </w:r>
+      <w:r>
+        <w:rPr>
+          <w:rFonts w:ascii="Times New Roman" w:hAnsi="Times New Roman" w:eastAsia="Times New Roman" w:cs="Times New Roman"/>
+          <w:color w:val="000000"/>
+          <w:sz w:val="24"/>
+        </w:rPr>
+        <w:t xml:space="preserve"> in </w:t>
+      </w:r>
+      <w:r>
+        <w:rPr>
+          <w:rFonts w:ascii="Courier New" w:hAnsi="Courier New" w:eastAsia="Courier New" w:cs="Courier New"/>
+          <w:color w:val="000000"/>
+          <w:sz w:val="23"/>
+        </w:rPr>
+        <w:t>Ice Paper</w:t>
+      </w:r>
+      <w:r>
+        <w:rPr>
+          <w:rFonts w:ascii="Times New Roman" w:hAnsi="Times New Roman" w:eastAsia="Times New Roman" w:cs="Times New Roman"/>
+          <w:color w:val="000000"/>
+          <w:sz w:val="24"/>
+        </w:rPr>
+        <w:t xml:space="preserve">). Shared passages of at least thirty characters connect 511 label pairs; the highest mutual involvement share is 48.5%, three pairs exceed 30%, none exceeds 50%. The 45 pairs at or above 10% were reviewed by the author and determined to be collaborations. No normalisation or merging is applied. </w:t>
+      </w:r>
+      <w:r>
+        <w:rPr>
+          <w:rFonts w:ascii="Courier New" w:hAnsi="Courier New" w:eastAsia="Courier New" w:cs="Courier New"/>
+          <w:color w:val="000000"/>
+          <w:sz w:val="23"/>
+        </w:rPr>
+        <w:t>results/label-identity-v1/</w:t>
+      </w:r>
+      <w:r>
+        <w:rPr>
+          <w:rFonts w:ascii="Times New Roman" w:hAnsi="Times New Roman" w:eastAsia="Times New Roman" w:cs="Times New Roman"/>
+          <w:color w:val="000000"/>
+          <w:sz w:val="24"/>
+        </w:rPr>
+        <w:t xml:space="preserve"> records the measurement and the determination separately.</w:t>
+      </w:r>
+    </w:p>
+    <w:p>
+      <w:pPr>
+        <w:widowControl/>
+        <w:spacing w:line="480" w:lineRule="auto" w:after="0"/>
+        <w:ind w:firstLine="360"/>
+      </w:pPr>
+      <w:r>
+        <w:rPr>
+          <w:rFonts w:ascii="Times New Roman" w:hAnsi="Times New Roman" w:eastAsia="Times New Roman" w:cs="Times New Roman"/>
+          <w:b/>
+          <w:color w:val="000000"/>
+          <w:sz w:val="24"/>
+        </w:rPr>
+        <w:t>Rhyme-form space.</w:t>
+      </w:r>
+      <w:r>
+        <w:rPr>
+          <w:rFonts w:ascii="Times New Roman" w:hAnsi="Times New Roman" w:eastAsia="Times New Roman" w:cs="Times New Roman"/>
+          <w:color w:val="000000"/>
+          <w:sz w:val="24"/>
+        </w:rPr>
+        <w:t xml:space="preserve"> A song's rhyme-form document is the sequence of tokens emitted for each classifiable line ending: </w:t>
+      </w:r>
+      <w:r>
+        <w:rPr>
+          <w:rFonts w:ascii="Courier New" w:hAnsi="Courier New" w:eastAsia="Courier New" w:cs="Courier New"/>
+          <w:color w:val="000000"/>
+          <w:sz w:val="23"/>
+        </w:rPr>
+        <w:t>FAM_x</w:t>
+      </w:r>
+      <w:r>
+        <w:rPr>
+          <w:rFonts w:ascii="Times New Roman" w:hAnsi="Times New Roman" w:eastAsia="Times New Roman" w:cs="Times New Roman"/>
+          <w:color w:val="000000"/>
+          <w:sz w:val="24"/>
+        </w:rPr>
+        <w:t xml:space="preserve"> (one of the seventeen families), </w:t>
+      </w:r>
+      <w:r>
+        <w:rPr>
+          <w:rFonts w:ascii="Courier New" w:hAnsi="Courier New" w:eastAsia="Courier New" w:cs="Courier New"/>
+          <w:color w:val="000000"/>
+          <w:sz w:val="23"/>
+        </w:rPr>
+        <w:t>TONE_t</w:t>
+      </w:r>
+      <w:r>
+        <w:rPr>
+          <w:rFonts w:ascii="Times New Roman" w:hAnsi="Times New Roman" w:eastAsia="Times New Roman" w:cs="Times New Roman"/>
+          <w:color w:val="000000"/>
+          <w:sz w:val="24"/>
+        </w:rPr>
+        <w:t xml:space="preserve">, </w:t>
+      </w:r>
+      <w:r>
+        <w:rPr>
+          <w:rFonts w:ascii="Courier New" w:hAnsi="Courier New" w:eastAsia="Courier New" w:cs="Courier New"/>
+          <w:color w:val="000000"/>
+          <w:sz w:val="23"/>
+        </w:rPr>
+        <w:t>PAIR_a&gt;b</w:t>
+      </w:r>
+      <w:r>
+        <w:rPr>
+          <w:rFonts w:ascii="Times New Roman" w:hAnsi="Times New Roman" w:eastAsia="Times New Roman" w:cs="Times New Roman"/>
+          <w:color w:val="000000"/>
+          <w:sz w:val="24"/>
+        </w:rPr>
+        <w:t xml:space="preserve"> (penultimate and last families), </w:t>
+      </w:r>
+      <w:r>
+        <w:rPr>
+          <w:rFonts w:ascii="Courier New" w:hAnsi="Courier New" w:eastAsia="Courier New" w:cs="Courier New"/>
+          <w:color w:val="000000"/>
+          <w:sz w:val="23"/>
+        </w:rPr>
+        <w:t>TR_a&gt;b</w:t>
+      </w:r>
+      <w:r>
+        <w:rPr>
+          <w:rFonts w:ascii="Times New Roman" w:hAnsi="Times New Roman" w:eastAsia="Times New Roman" w:cs="Times New Roman"/>
+          <w:color w:val="000000"/>
+          <w:sz w:val="24"/>
+        </w:rPr>
+        <w:t xml:space="preserve"> (previous line's family to this one), </w:t>
+      </w:r>
+      <w:r>
+        <w:rPr>
+          <w:rFonts w:ascii="Courier New" w:hAnsi="Courier New" w:eastAsia="Courier New" w:cs="Courier New"/>
+          <w:color w:val="000000"/>
+          <w:sz w:val="23"/>
+        </w:rPr>
+        <w:t>SAME</w:t>
+      </w:r>
+      <w:r>
+        <w:rPr>
+          <w:rFonts w:ascii="Times New Roman" w:hAnsi="Times New Roman" w:eastAsia="Times New Roman" w:cs="Times New Roman"/>
+          <w:color w:val="000000"/>
+          <w:sz w:val="24"/>
+        </w:rPr>
+        <w:t xml:space="preserve"> or </w:t>
+      </w:r>
+      <w:r>
+        <w:rPr>
+          <w:rFonts w:ascii="Courier New" w:hAnsi="Courier New" w:eastAsia="Courier New" w:cs="Courier New"/>
+          <w:color w:val="000000"/>
+          <w:sz w:val="23"/>
+        </w:rPr>
+        <w:t>SHIFT</w:t>
+      </w:r>
+      <w:r>
+        <w:rPr>
+          <w:rFonts w:ascii="Times New Roman" w:hAnsi="Times New Roman" w:eastAsia="Times New Roman" w:cs="Times New Roman"/>
+          <w:color w:val="000000"/>
+          <w:sz w:val="24"/>
+        </w:rPr>
+        <w:t xml:space="preserve">, and one </w:t>
+      </w:r>
+      <w:r>
+        <w:rPr>
+          <w:rFonts w:ascii="Courier New" w:hAnsi="Courier New" w:eastAsia="Courier New" w:cs="Courier New"/>
+          <w:color w:val="000000"/>
+          <w:sz w:val="23"/>
+        </w:rPr>
+        <w:t>RUN_k</w:t>
+      </w:r>
+      <w:r>
+        <w:rPr>
+          <w:rFonts w:ascii="Times New Roman" w:hAnsi="Times New Roman" w:eastAsia="Times New Roman" w:cs="Times New Roman"/>
+          <w:color w:val="000000"/>
+          <w:sz w:val="24"/>
+        </w:rPr>
+        <w:t xml:space="preserve"> token per maximal run of same-family endings (buckets 1, 2, 3, 4+). The second tier adds </w:t>
+      </w:r>
+      <w:r>
+        <w:rPr>
+          <w:rFonts w:ascii="Courier New" w:hAnsi="Courier New" w:eastAsia="Courier New" w:cs="Courier New"/>
+          <w:color w:val="000000"/>
+          <w:sz w:val="23"/>
+        </w:rPr>
+        <w:t>FIN_</w:t>
+      </w:r>
+      <w:r>
+        <w:rPr>
+          <w:rFonts w:ascii="Times New Roman" w:hAnsi="Times New Roman" w:eastAsia="Times New Roman" w:cs="Times New Roman"/>
+          <w:color w:val="000000"/>
+          <w:sz w:val="24"/>
+        </w:rPr>
+        <w:t xml:space="preserve">, </w:t>
+      </w:r>
+      <w:r>
+        <w:rPr>
+          <w:rFonts w:ascii="Courier New" w:hAnsi="Courier New" w:eastAsia="Courier New" w:cs="Courier New"/>
+          <w:color w:val="000000"/>
+          <w:sz w:val="23"/>
+        </w:rPr>
+        <w:t>FINT_</w:t>
+      </w:r>
+      <w:r>
+        <w:rPr>
+          <w:rFonts w:ascii="Times New Roman" w:hAnsi="Times New Roman" w:eastAsia="Times New Roman" w:cs="Times New Roman"/>
+          <w:color w:val="000000"/>
+          <w:sz w:val="24"/>
+        </w:rPr>
+        <w:t xml:space="preserve">, and </w:t>
+      </w:r>
+      <w:r>
+        <w:rPr>
+          <w:rFonts w:ascii="Courier New" w:hAnsi="Courier New" w:eastAsia="Courier New" w:cs="Courier New"/>
+          <w:color w:val="000000"/>
+          <w:sz w:val="23"/>
+        </w:rPr>
+        <w:t>PFIN_</w:t>
+      </w:r>
+      <w:r>
+        <w:rPr>
+          <w:rFonts w:ascii="Times New Roman" w:hAnsi="Times New Roman" w:eastAsia="Times New Roman" w:cs="Times New Roman"/>
+          <w:color w:val="000000"/>
+          <w:sz w:val="24"/>
+        </w:rPr>
+        <w:t xml:space="preserve"> tokens for the raw final, toned final, and final pair. Tokens are weighted by the lexical system's TF–IDF settings (document frequency at least three, sublinear term frequency, L2 rows), giving 605 and 1,997 features. Songs with fewer than four classifiable endings receive the worst rank in any system that uses this space; 7,129 of 7,236 queries are covered.</w:t>
+      </w:r>
+    </w:p>
+    <w:p>
+      <w:pPr>
+        <w:widowControl/>
+        <w:spacing w:line="480" w:lineRule="auto" w:after="0"/>
+        <w:ind w:firstLine="360"/>
+      </w:pPr>
+      <w:r>
+        <w:rPr>
+          <w:rFonts w:ascii="Times New Roman" w:hAnsi="Times New Roman" w:eastAsia="Times New Roman" w:cs="Times New Roman"/>
+          <w:b/>
+          <w:color w:val="000000"/>
+          <w:sz w:val="24"/>
+        </w:rPr>
+        <w:t>Neutralisation arms.</w:t>
+      </w:r>
+      <w:r>
+        <w:rPr>
+          <w:rFonts w:ascii="Times New Roman" w:hAnsi="Times New Roman" w:eastAsia="Times New Roman" w:cs="Times New Roman"/>
+          <w:color w:val="000000"/>
+          <w:sz w:val="24"/>
+        </w:rPr>
+        <w:t xml:space="preserve"> Each arm's surfaces are removed from every song before the character space is refitted: Latin surfaces as whole words (a Han character counts as a boundary), Han surfaces as substrings. The reference-core arm has 90 surfaces; places 212 (types GPE, LOC, FAC); named entities 459 (every type except hip-hop slang, English words, and language names); the whole catalogue 605. The dense system is not neutralised because that would require re-embedding, which is a separate GPU run.</w:t>
+      </w:r>
+    </w:p>
+    <w:p>
+      <w:pPr>
+        <w:pStyle w:val="Heading1"/>
+      </w:pPr>
+      <w:r>
+        <w:t>S9. The Whitening Probe</w:t>
+      </w:r>
+    </w:p>
+    <w:p>
+      <w:pPr>
+        <w:widowControl/>
+        <w:spacing w:line="480" w:lineRule="auto" w:after="0"/>
+      </w:pPr>
+      <w:r>
+        <w:rPr>
+          <w:rFonts w:ascii="Times New Roman" w:hAnsi="Times New Roman" w:eastAsia="Times New Roman" w:cs="Times New Roman"/>
+          <w:b/>
+          <w:color w:val="000000"/>
+          <w:sz w:val="24"/>
+        </w:rPr>
+        <w:t>Transform.</w:t>
+      </w:r>
+      <w:r>
+        <w:rPr>
+          <w:rFonts w:ascii="Times New Roman" w:hAnsi="Times New Roman" w:eastAsia="Times New Roman" w:cs="Times New Roman"/>
+          <w:color w:val="000000"/>
+          <w:sz w:val="24"/>
+        </w:rPr>
+        <w:t xml:space="preserve"> For a training set of song vectors x_i with labels c_i and weights w_i (each (leakage group, label) component weighted one), the within-author covariance is Σ_w = Σ_i w_i (x_i − μ_c_i)(x_i − μ_c_i)ᵀ / Σ_i w_i, with μ_c the weighted label mean; Ledoit–Wolf shrinkage towards a scaled identity is estimated on the weighted residuals (shrinkage 0.030–0.031 across folds). The transform maps a song vector to Σ_w^(−1/2)(x − μ) by the symmetric (ZCA) square root and re-normalises it; label profiles and cosine ranking then run unchanged. </w:t>
+      </w:r>
+      <w:r>
+        <w:rPr>
+          <w:rFonts w:ascii="Times New Roman" w:hAnsi="Times New Roman" w:eastAsia="Times New Roman" w:cs="Times New Roman"/>
+          <w:i/>
+          <w:color w:val="000000"/>
+          <w:sz w:val="24"/>
+        </w:rPr>
+        <w:t>Total whitening</w:t>
+      </w:r>
+      <w:r>
+        <w:rPr>
+          <w:rFonts w:ascii="Times New Roman" w:hAnsi="Times New Roman" w:eastAsia="Times New Roman" w:cs="Times New Roman"/>
+          <w:color w:val="000000"/>
+          <w:sz w:val="24"/>
+        </w:rPr>
+        <w:t xml:space="preserve"> uses the total covariance about the weighted mean (shrinkage 0.024); </w:t>
+      </w:r>
+      <w:r>
+        <w:rPr>
+          <w:rFonts w:ascii="Times New Roman" w:hAnsi="Times New Roman" w:eastAsia="Times New Roman" w:cs="Times New Roman"/>
+          <w:i/>
+          <w:color w:val="000000"/>
+          <w:sz w:val="24"/>
+        </w:rPr>
+        <w:t>permuted-label whitening</w:t>
+      </w:r>
+      <w:r>
+        <w:rPr>
+          <w:rFonts w:ascii="Times New Roman" w:hAnsi="Times New Roman" w:eastAsia="Times New Roman" w:cs="Times New Roman"/>
+          <w:color w:val="000000"/>
+          <w:sz w:val="24"/>
+        </w:rPr>
+        <w:t xml:space="preserve"> shuffles the training labels before estimating Σ_w; </w:t>
+      </w:r>
+      <w:r>
+        <w:rPr>
+          <w:rFonts w:ascii="Times New Roman" w:hAnsi="Times New Roman" w:eastAsia="Times New Roman" w:cs="Times New Roman"/>
+          <w:i/>
+          <w:color w:val="000000"/>
+          <w:sz w:val="24"/>
+        </w:rPr>
+        <w:t>centring</w:t>
+      </w:r>
+      <w:r>
+        <w:rPr>
+          <w:rFonts w:ascii="Times New Roman" w:hAnsi="Times New Roman" w:eastAsia="Times New Roman" w:cs="Times New Roman"/>
+          <w:color w:val="000000"/>
+          <w:sz w:val="24"/>
+        </w:rPr>
+        <w:t xml:space="preserve"> subtracts the mean only. Within-author variation is 89.5–89.7% of the total variance across folds, against 95.9–96.1% under the permutation null.</w:t>
+      </w:r>
+    </w:p>
+    <w:p>
+      <w:pPr>
+        <w:widowControl/>
+        <w:spacing w:line="480" w:lineRule="auto" w:after="0"/>
+        <w:ind w:firstLine="360"/>
+      </w:pPr>
+      <w:r>
+        <w:rPr>
+          <w:rFonts w:ascii="Times New Roman" w:hAnsi="Times New Roman" w:eastAsia="Times New Roman" w:cs="Times New Roman"/>
+          <w:b/>
+          <w:color w:val="000000"/>
+          <w:sz w:val="24"/>
+        </w:rPr>
+        <w:t>Folds.</w:t>
+      </w:r>
+      <w:r>
+        <w:rPr>
+          <w:rFonts w:ascii="Times New Roman" w:hAnsi="Times New Roman" w:eastAsia="Times New Roman" w:cs="Times New Roman"/>
+          <w:color w:val="000000"/>
+          <w:sz w:val="24"/>
+        </w:rPr>
+        <w:t xml:space="preserve"> Leakage groups are dealt into five folds with seed 20260825 (1,408 / 1,492 / 1,507 / 1,382 / 1,447 queries). Every fold's transform is fitted on the other four folds' songs and applied to every song; only the fold's own queries are scored, against profiles built from all other songs exactly as in the main protocol. The dense scorer reproduces the builder's scores to 7 × 10⁻⁷ and the untransformed space reproduces the builder's MRR (0.3181) before any transformed space is trusted.</w:t>
+      </w:r>
+    </w:p>
+    <w:p>
+      <w:pPr>
+        <w:widowControl/>
+        <w:spacing w:line="480" w:lineRule="auto" w:after="0"/>
+        <w:ind w:firstLine="360"/>
+      </w:pPr>
+      <w:r>
+        <w:rPr>
+          <w:rFonts w:ascii="Times New Roman" w:hAnsi="Times New Roman" w:eastAsia="Times New Roman" w:cs="Times New Roman"/>
+          <w:b/>
+          <w:color w:val="000000"/>
+          <w:sz w:val="24"/>
+        </w:rPr>
+        <w:t>Matched-dimension lexical control.</w:t>
+      </w:r>
+      <w:r>
+        <w:rPr>
+          <w:rFonts w:ascii="Times New Roman" w:hAnsi="Times New Roman" w:eastAsia="Times New Roman" w:cs="Times New Roman"/>
+          <w:color w:val="000000"/>
+          <w:sz w:val="24"/>
+        </w:rPr>
+        <w:t xml:space="preserve"> The TF–IDF rows are reduced by a truncated singular-value decomposition to 1,024 components fitted fold-wise on the training songs (43.7–43.8% of variance kept), unit-normalised, and given the same five transforms. Untransformed, the reduced space scores 0.393 (−0.057 against the full 150,000-feature rows, interval [−0.062, −0.052]); total whitening lifts it to 0.511 and within-author whitening to 0.518, +0.008 ([+0.005, +0.011]) over total and +0.009 ([+0.006, +0.012]) over the permutation null. The whitened lexical space exceeds the whitened semantic space by 0.070 ([+0.060, +0.081]). Fusing the two whitened spaces by the same equal-weight z-score rule gives 0.587 (Recall@1 0.482, Recall@10 0.783), +0.042 ([+0.037, +0.047]) over the fusion of raw lexical with whitened semantic and +0.069 ([+0.062, +0.075]) over the whitened lexical space alone.</w:t>
+      </w:r>
+    </w:p>
+    <w:p>
+      <w:pPr>
+        <w:widowControl/>
+        <w:spacing w:line="480" w:lineRule="auto" w:after="0"/>
+        <w:ind w:firstLine="360"/>
+      </w:pPr>
+      <w:r>
+        <w:rPr>
+          <w:rFonts w:ascii="Times New Roman" w:hAnsi="Times New Roman" w:eastAsia="Times New Roman" w:cs="Times New Roman"/>
+          <w:b/>
+          <w:color w:val="000000"/>
+          <w:sz w:val="24"/>
+        </w:rPr>
+        <w:t>Transfer.</w:t>
+      </w:r>
+      <w:r>
+        <w:rPr>
+          <w:rFonts w:ascii="Times New Roman" w:hAnsi="Times New Roman" w:eastAsia="Times New Roman" w:cs="Times New Roman"/>
+          <w:color w:val="000000"/>
+          <w:sz w:val="24"/>
+        </w:rPr>
+        <w:t xml:space="preserve"> A deterministic 15% of labels (34 of 226, seed 20260825) is held out whole. Transforms are fitted on the other labels' songs only and the held-out labels' queries are scored against the usual leave-group-out profiles of all 226 labels. On those queries the untransformed space scores 0.297; total whitening 0.455 (+0.156, [+0.131, +0.180]); within-author whitening fitted on other authors 0.429 (+0.129 over untransformed, but −0.027 against total, [−0.035, −0.019]); the fold-wise within-author transform that had seen those authors 0.421 (−0.008 against the unseen-author transform, [−0.016, −0.000]).</w:t>
+      </w:r>
+    </w:p>
+    <w:p>
+      <w:pPr>
+        <w:widowControl/>
+        <w:spacing w:line="480" w:lineRule="auto" w:after="0"/>
+        <w:ind w:firstLine="360"/>
+      </w:pPr>
+      <w:r>
+        <w:rPr>
+          <w:rFonts w:ascii="Times New Roman" w:hAnsi="Times New Roman" w:eastAsia="Times New Roman" w:cs="Times New Roman"/>
+          <w:b/>
+          <w:color w:val="000000"/>
+          <w:sz w:val="24"/>
+        </w:rPr>
+        <w:t>Averaging.</w:t>
+      </w:r>
+      <w:r>
+        <w:rPr>
+          <w:rFonts w:ascii="Times New Roman" w:hAnsi="Times New Roman" w:eastAsia="Times New Roman" w:cs="Times New Roman"/>
+          <w:color w:val="000000"/>
+          <w:sz w:val="24"/>
+        </w:rPr>
+        <w:t xml:space="preserve"> </w:t>
+      </w:r>
+      <w:r>
+        <w:rPr>
+          <w:rFonts w:ascii="Courier New" w:hAnsi="Courier New" w:eastAsia="Courier New" w:cs="Courier New"/>
+          <w:color w:val="000000"/>
+          <w:sz w:val="23"/>
+        </w:rPr>
+        <w:t>results/retrieval-v2/identity_estimands.json</w:t>
+      </w:r>
+      <w:r>
+        <w:rPr>
+          <w:rFonts w:ascii="Times New Roman" w:hAnsi="Times New Roman" w:eastAsia="Times New Roman" w:cs="Times New Roman"/>
+          <w:color w:val="000000"/>
+          <w:sz w:val="24"/>
+        </w:rPr>
+        <w:t xml:space="preserve"> reports every system of the identity-space and probe experiments under plain (per-query), component-weighted, and macro (per-label) averaging. Under the macro estimand the raw semantic space scores 0.301, the raw lexical 0.398, within-author whitening 0.440, the whitened lexical space 0.487, the fusion of raw lexical with whitened semantic 0.506, and the fusion of the two whitened spaces 0.564; the ordering of spaces is the same under every average.</w:t>
       </w:r>
     </w:p>
     <w:p>

</xml_diff>